<commit_message>
Adds initial version of Dino PDF
Introduces version 0.0.1 of the Dino schematic.
</commit_message>
<xml_diff>
--- a/dino/docs/Dino_v0_1.docx
+++ b/dino/docs/Dino_v0_1.docx
@@ -7,7 +7,13 @@
         <w:pStyle w:val="Title"/>
       </w:pPr>
       <w:r>
-        <w:t>Dino v0.1 — Build Instructions and Bill of Materials</w:t>
+        <w:t>Dino v0.1</w:t>
+      </w:r>
+      <w:r>
+        <w:t>.0</w:t>
+      </w:r>
+      <w:r>
+        <w:t xml:space="preserve"> — Build Instructions and Bill of Materials</w:t>
       </w:r>
     </w:p>
     <w:p>
@@ -136,7 +142,13 @@
               <w:pStyle w:val="Compact"/>
             </w:pPr>
             <w:r>
-              <w:t>Dino v0.01</w:t>
+              <w:t>Dino v0.0</w:t>
+            </w:r>
+            <w:r>
+              <w:t>.</w:t>
+            </w:r>
+            <w:r>
+              <w:t>1</w:t>
             </w:r>
           </w:p>
           <w:p>

</xml_diff>